<commit_message>
docs(ac): correct student access instructions and password policy in AC guide
</commit_message>
<xml_diff>
--- a/docs/AC-Lab-Completion-Guide.docx
+++ b/docs/AC-Lab-Completion-Guide.docx
@@ -773,7 +773,7 @@
         <w:pStyle w:val="FirstParagraph"/>
       </w:pPr>
       <w:r>
-        <w:t xml:space="preserve">After logging in, you will see a list of available connections. Each student has two pre-configured connections:</w:t>
+        <w:t xml:space="preserve">After logging in you will see one connection for your pod:</w:t>
       </w:r>
     </w:p>
     <w:tbl>
@@ -844,43 +844,7 @@
               <w:jc w:val="left"/>
             </w:pPr>
             <w:r>
-              <w:t xml:space="preserve">Domain Controller —</w:t>
-            </w:r>
-            <w:r>
-              <w:t xml:space="preserve"> </w:t>
-            </w:r>
-            <w:r>
-              <w:rPr>
-                <w:b/>
-              </w:rPr>
-              <w:t xml:space="preserve">use this for all AC labs</w:t>
-            </w:r>
-          </w:p>
-        </w:tc>
-      </w:tr>
-      <w:tr>
-        <w:tc>
-          <w:p>
-            <w:pPr>
-              <w:pStyle w:val="Compact"/>
-              <w:jc w:val="left"/>
-            </w:pPr>
-            <w:r>
-              <w:rPr>
-                <w:b/>
-              </w:rPr>
-              <w:t xml:space="preserve">PODXX-WS01</w:t>
-            </w:r>
-          </w:p>
-        </w:tc>
-        <w:tc>
-          <w:p>
-            <w:pPr>
-              <w:pStyle w:val="Compact"/>
-              <w:jc w:val="left"/>
-            </w:pPr>
-            <w:r>
-              <w:t xml:space="preserve">Workstation (used for other lab families)</w:t>
+              <w:t xml:space="preserve">Domain Controller — your desktop for the AC labs and every other lab family</w:t>
             </w:r>
           </w:p>
         </w:tc>
@@ -888,6 +852,35 @@
     </w:tbl>
     <w:p>
       <w:pPr>
+        <w:pStyle w:val="BodyText"/>
+      </w:pPr>
+      <w:r>
+        <w:t xml:space="preserve">Your pod's pfSense firewall (used in the SC labs) is not a connection here: you</w:t>
+      </w:r>
+      <w:r>
+        <w:t xml:space="preserve"> </w:t>
+      </w:r>
+      <w:r>
+        <w:t xml:space="preserve">reach it by browsing to</w:t>
+      </w:r>
+      <w:r>
+        <w:t xml:space="preserve"> </w:t>
+      </w:r>
+      <w:r>
+        <w:rPr>
+          <w:rStyle w:val="VerbatimChar"/>
+        </w:rPr>
+        <w:t xml:space="preserve">http://10.51.XX.1</w:t>
+      </w:r>
+      <w:r>
+        <w:t xml:space="preserve"> </w:t>
+      </w:r>
+      <w:r>
+        <w:t xml:space="preserve">from inside this desktop.</w:t>
+      </w:r>
+    </w:p>
+    <w:p>
+      <w:pPr>
         <w:numPr>
           <w:ilvl w:val="0"/>
           <w:numId w:val="1007"/>
@@ -1027,61 +1020,7 @@
         <w:pStyle w:val="Compact"/>
       </w:pPr>
       <w:r>
-        <w:t xml:space="preserve">On the server desktop, look for the</w:t>
-      </w:r>
-      <w:r>
-        <w:t xml:space="preserve"> </w:t>
-      </w:r>
-      <w:r>
-        <w:rPr>
-          <w:b/>
-        </w:rPr>
-        <w:t xml:space="preserve">Server Manager</w:t>
-      </w:r>
-      <w:r>
-        <w:t xml:space="preserve"> </w:t>
-      </w:r>
-      <w:r>
-        <w:t xml:space="preserve">window (it usually opens automatically)</w:t>
-      </w:r>
-    </w:p>
-    <w:p>
-      <w:pPr>
-        <w:numPr>
-          <w:ilvl w:val="0"/>
-          <w:numId w:val="1008"/>
-        </w:numPr>
-        <w:pStyle w:val="Compact"/>
-      </w:pPr>
-      <w:r>
-        <w:t xml:space="preserve">Click</w:t>
-      </w:r>
-      <w:r>
-        <w:t xml:space="preserve"> </w:t>
-      </w:r>
-      <w:r>
-        <w:rPr>
-          <w:b/>
-        </w:rPr>
-        <w:t xml:space="preserve">Tools</w:t>
-      </w:r>
-      <w:r>
-        <w:t xml:space="preserve"> </w:t>
-      </w:r>
-      <w:r>
-        <w:t xml:space="preserve">in the top-right menu bar</w:t>
-      </w:r>
-    </w:p>
-    <w:p>
-      <w:pPr>
-        <w:numPr>
-          <w:ilvl w:val="0"/>
-          <w:numId w:val="1008"/>
-        </w:numPr>
-        <w:pStyle w:val="Compact"/>
-      </w:pPr>
-      <w:r>
-        <w:t xml:space="preserve">Select</w:t>
+        <w:t xml:space="preserve">On the server desktop, double-click the</w:t>
       </w:r>
       <w:r>
         <w:t xml:space="preserve"> </w:t>
@@ -1096,7 +1035,7 @@
         <w:t xml:space="preserve"> </w:t>
       </w:r>
       <w:r>
-        <w:t xml:space="preserve">from the dropdown menu</w:t>
+        <w:t xml:space="preserve">shortcut</w:t>
       </w:r>
     </w:p>
     <w:p>
@@ -1162,6 +1101,71 @@
       </w:r>
       <w:r>
         <w:t xml:space="preserve">and press Enter</w:t>
+      </w:r>
+    </w:p>
+    <w:p>
+      <w:pPr>
+        <w:pStyle w:val="BlockText"/>
+      </w:pPr>
+      <w:r>
+        <w:rPr>
+          <w:b/>
+        </w:rPr>
+        <w:t xml:space="preserve">Do not use Server Manager.</w:t>
+      </w:r>
+      <w:r>
+        <w:t xml:space="preserve"> </w:t>
+      </w:r>
+      <w:r>
+        <w:t xml:space="preserve">It requires administrator rights on the shared</w:t>
+      </w:r>
+      <w:r>
+        <w:t xml:space="preserve"> </w:t>
+      </w:r>
+      <w:r>
+        <w:t xml:space="preserve">server, which student accounts do not have. If you open it you will get a</w:t>
+      </w:r>
+      <w:r>
+        <w:t xml:space="preserve"> </w:t>
+      </w:r>
+      <w:r>
+        <w:t xml:space="preserve">credential prompt that ends in</w:t>
+      </w:r>
+      <w:r>
+        <w:t xml:space="preserve"> </w:t>
+      </w:r>
+      <w:r>
+        <w:rPr>
+          <w:i/>
+        </w:rPr>
+        <w:t xml:space="preserve">"Logon failure: the user has not been granted</w:t>
+      </w:r>
+      <w:r>
+        <w:rPr>
+          <w:i/>
+        </w:rPr>
+        <w:t xml:space="preserve"> </w:t>
+      </w:r>
+      <w:r>
+        <w:rPr>
+          <w:i/>
+        </w:rPr>
+        <w:t xml:space="preserve">the requested logon type at this computer"</w:t>
+      </w:r>
+      <w:r>
+        <w:t xml:space="preserve">. Close the prompt and use the</w:t>
+      </w:r>
+      <w:r>
+        <w:t xml:space="preserve"> </w:t>
+      </w:r>
+      <w:r>
+        <w:t xml:space="preserve">desktop shortcut above — your own account already has the rights you need for</w:t>
+      </w:r>
+      <w:r>
+        <w:t xml:space="preserve"> </w:t>
+      </w:r>
+      <w:r>
+        <w:t xml:space="preserve">every lab in this guide.</w:t>
       </w:r>
     </w:p>
     <w:p>
@@ -3621,7 +3625,79 @@
         <w:pStyle w:val="Compact"/>
       </w:pPr>
       <w:r>
-        <w:t xml:space="preserve">Enter a password (use the lab password your instructor provided)</w:t>
+        <w:t xml:space="preserve">Enter a password. The domain now enforces a strong policy, so it must be</w:t>
+      </w:r>
+      <w:r>
+        <w:t xml:space="preserve"> </w:t>
+      </w:r>
+      <w:r>
+        <w:rPr>
+          <w:b/>
+        </w:rPr>
+        <w:t xml:space="preserve">at</w:t>
+      </w:r>
+      <w:r>
+        <w:rPr>
+          <w:b/>
+        </w:rPr>
+        <w:t xml:space="preserve"> </w:t>
+      </w:r>
+      <w:r>
+        <w:rPr>
+          <w:b/>
+        </w:rPr>
+        <w:t xml:space="preserve">least 12 characters</w:t>
+      </w:r>
+      <w:r>
+        <w:t xml:space="preserve"> </w:t>
+      </w:r>
+      <w:r>
+        <w:t xml:space="preserve">and include an upper-case letter, a lower-case letter, a</w:t>
+      </w:r>
+      <w:r>
+        <w:t xml:space="preserve"> </w:t>
+      </w:r>
+      <w:r>
+        <w:t xml:space="preserve">number and a symbol (for example</w:t>
+      </w:r>
+      <w:r>
+        <w:t xml:space="preserve"> </w:t>
+      </w:r>
+      <w:r>
+        <w:rPr>
+          <w:rStyle w:val="VerbatimChar"/>
+        </w:rPr>
+        <w:t xml:space="preserve">LabUser!2026#ac</w:t>
+      </w:r>
+      <w:r>
+        <w:t xml:space="preserve">). A shorter or simpler</w:t>
+      </w:r>
+      <w:r>
+        <w:t xml:space="preserve"> </w:t>
+      </w:r>
+      <w:r>
+        <w:t xml:space="preserve">password is rejected with</w:t>
+      </w:r>
+      <w:r>
+        <w:t xml:space="preserve"> </w:t>
+      </w:r>
+      <w:r>
+        <w:rPr>
+          <w:i/>
+        </w:rPr>
+        <w:t xml:space="preserve">"Windows cannot set the password ... it does not</w:t>
+      </w:r>
+      <w:r>
+        <w:rPr>
+          <w:i/>
+        </w:rPr>
+        <w:t xml:space="preserve"> </w:t>
+      </w:r>
+      <w:r>
+        <w:rPr>
+          <w:i/>
+        </w:rPr>
+        <w:t xml:space="preserve">meet the length, complexity, or history requirement of the domain."</w:t>
       </w:r>
     </w:p>
     <w:p>
@@ -8415,6 +8491,78 @@
           <w:b/>
         </w:rPr>
         <w:t xml:space="preserve">Windows + R → dsa.msc → Enter</w:t>
+      </w:r>
+    </w:p>
+    <w:p>
+      <w:pPr>
+        <w:numPr>
+          <w:ilvl w:val="0"/>
+          <w:numId w:val="1039"/>
+        </w:numPr>
+        <w:pStyle w:val="Compact"/>
+      </w:pPr>
+      <w:r>
+        <w:t xml:space="preserve">If Windows refuses a password you typed, it is the domain password policy, not</w:t>
+      </w:r>
+      <w:r>
+        <w:t xml:space="preserve"> </w:t>
+      </w:r>
+      <w:r>
+        <w:t xml:space="preserve">your account: use 12+ characters with upper case, lower case, a number and a</w:t>
+      </w:r>
+      <w:r>
+        <w:t xml:space="preserve"> </w:t>
+      </w:r>
+      <w:r>
+        <w:t xml:space="preserve">symbol, and do not reuse a recent password</w:t>
+      </w:r>
+    </w:p>
+    <w:p>
+      <w:pPr>
+        <w:numPr>
+          <w:ilvl w:val="0"/>
+          <w:numId w:val="1039"/>
+        </w:numPr>
+        <w:pStyle w:val="Compact"/>
+      </w:pPr>
+      <w:r>
+        <w:t xml:space="preserve">If a</w:t>
+      </w:r>
+      <w:r>
+        <w:t xml:space="preserve"> </w:t>
+      </w:r>
+      <w:r>
+        <w:rPr>
+          <w:b/>
+        </w:rPr>
+        <w:t xml:space="preserve">Windows Security</w:t>
+      </w:r>
+      <w:r>
+        <w:t xml:space="preserve"> </w:t>
+      </w:r>
+      <w:r>
+        <w:t xml:space="preserve">credential prompt appears (usually from Server</w:t>
+      </w:r>
+      <w:r>
+        <w:t xml:space="preserve"> </w:t>
+      </w:r>
+      <w:r>
+        <w:t xml:space="preserve">Manager), click</w:t>
+      </w:r>
+      <w:r>
+        <w:t xml:space="preserve"> </w:t>
+      </w:r>
+      <w:r>
+        <w:rPr>
+          <w:b/>
+        </w:rPr>
+        <w:t xml:space="preserve">Cancel</w:t>
+      </w:r>
+      <w:r>
+        <w:t xml:space="preserve"> </w:t>
+      </w:r>
+      <w:r>
+        <w:t xml:space="preserve">— no lab in this guide needs an administrator tool</w:t>
       </w:r>
     </w:p>
     <w:p>

</xml_diff>

<commit_message>
docs(ac): flag PDF paste dropping spaces in the L4.2 PowerShell command
Students hit "'Get-ADUser-Filter' is not recognized" because copying from the
PDF loses the space before each option. Adds a paste-safe multi-line form of the
L4.2 export, drops the unused -Properties MemberOf, and adds a general
troubleshooting entry.
</commit_message>
<xml_diff>
--- a/docs/AC-Lab-Completion-Guide.docx
+++ b/docs/AC-Lab-Completion-Guide.docx
@@ -6950,7 +6950,319 @@
         <w:rPr>
           <w:rStyle w:val="NormalTok"/>
         </w:rPr>
-        <w:t xml:space="preserve"> -Properties MemberOf | </w:t>
+        <w:t xml:space="preserve"> | </w:t>
+      </w:r>
+      <w:r>
+        <w:rPr>
+          <w:rStyle w:val="FunctionTok"/>
+        </w:rPr>
+        <w:t xml:space="preserve">Select-Object</w:t>
+      </w:r>
+      <w:r>
+        <w:rPr>
+          <w:rStyle w:val="NormalTok"/>
+        </w:rPr>
+        <w:t xml:space="preserve"> Name, SamAccountName, Enabled | </w:t>
+      </w:r>
+      <w:r>
+        <w:rPr>
+          <w:rStyle w:val="FunctionTok"/>
+        </w:rPr>
+        <w:t xml:space="preserve">Export-Csv</w:t>
+      </w:r>
+      <w:r>
+        <w:rPr>
+          <w:rStyle w:val="NormalTok"/>
+        </w:rPr>
+        <w:t xml:space="preserve"> </w:t>
+      </w:r>
+      <w:r>
+        <w:rPr>
+          <w:rStyle w:val="StringTok"/>
+        </w:rPr>
+        <w:t xml:space="preserve">"C:\CyberLab\Pod03\Lab4-2\review.csv"</w:t>
+      </w:r>
+      <w:r>
+        <w:rPr>
+          <w:rStyle w:val="NormalTok"/>
+        </w:rPr>
+        <w:t xml:space="preserve"> -NoTypeInformation</w:t>
+      </w:r>
+    </w:p>
+    <w:p>
+      <w:pPr>
+        <w:numPr>
+          <w:ilvl w:val="0"/>
+          <w:numId w:val="1000"/>
+        </w:numPr>
+        <w:pStyle w:val="BlockText"/>
+      </w:pPr>
+      <w:r>
+        <w:rPr>
+          <w:b/>
+        </w:rPr>
+        <w:t xml:space="preserve">If you copy this out of the PDF, check the spaces.</w:t>
+      </w:r>
+      <w:r>
+        <w:t xml:space="preserve"> </w:t>
+      </w:r>
+      <w:r>
+        <w:t xml:space="preserve">Copying from a PDF often</w:t>
+      </w:r>
+      <w:r>
+        <w:t xml:space="preserve"> </w:t>
+      </w:r>
+      <w:r>
+        <w:t xml:space="preserve">drops them, and</w:t>
+      </w:r>
+      <w:r>
+        <w:t xml:space="preserve"> </w:t>
+      </w:r>
+      <w:r>
+        <w:rPr>
+          <w:rStyle w:val="VerbatimChar"/>
+        </w:rPr>
+        <w:t xml:space="preserve">Get-ADUser -Filter</w:t>
+      </w:r>
+      <w:r>
+        <w:t xml:space="preserve"> </w:t>
+      </w:r>
+      <w:r>
+        <w:t xml:space="preserve">becomes</w:t>
+      </w:r>
+      <w:r>
+        <w:t xml:space="preserve"> </w:t>
+      </w:r>
+      <w:r>
+        <w:rPr>
+          <w:rStyle w:val="VerbatimChar"/>
+        </w:rPr>
+        <w:t xml:space="preserve">Get-ADUser-Filter</w:t>
+      </w:r>
+      <w:r>
+        <w:t xml:space="preserve">, which PowerShell</w:t>
+      </w:r>
+      <w:r>
+        <w:t xml:space="preserve"> </w:t>
+      </w:r>
+      <w:r>
+        <w:t xml:space="preserve">reports as</w:t>
+      </w:r>
+      <w:r>
+        <w:t xml:space="preserve"> </w:t>
+      </w:r>
+      <w:r>
+        <w:rPr>
+          <w:i/>
+        </w:rPr>
+        <w:t xml:space="preserve">"The term 'Get-ADUser-Filter' is not recognized as the name of a</w:t>
+      </w:r>
+      <w:r>
+        <w:rPr>
+          <w:i/>
+        </w:rPr>
+        <w:t xml:space="preserve"> </w:t>
+      </w:r>
+      <w:r>
+        <w:rPr>
+          <w:i/>
+        </w:rPr>
+        <w:t xml:space="preserve">cmdlet"</w:t>
+      </w:r>
+      <w:r>
+        <w:t xml:space="preserve">. There must be a space after</w:t>
+      </w:r>
+      <w:r>
+        <w:t xml:space="preserve"> </w:t>
+      </w:r>
+      <w:r>
+        <w:rPr>
+          <w:rStyle w:val="VerbatimChar"/>
+        </w:rPr>
+        <w:t xml:space="preserve">Get-ADUser</w:t>
+      </w:r>
+      <w:r>
+        <w:t xml:space="preserve">, after</w:t>
+      </w:r>
+      <w:r>
+        <w:t xml:space="preserve"> </w:t>
+      </w:r>
+      <w:r>
+        <w:rPr>
+          <w:rStyle w:val="VerbatimChar"/>
+        </w:rPr>
+        <w:t xml:space="preserve">-Filter {...}</w:t>
+      </w:r>
+      <w:r>
+        <w:t xml:space="preserve">, after</w:t>
+      </w:r>
+      <w:r>
+        <w:t xml:space="preserve"> </w:t>
+      </w:r>
+      <w:r>
+        <w:rPr>
+          <w:rStyle w:val="VerbatimChar"/>
+        </w:rPr>
+        <w:t xml:space="preserve">-SearchBase "..."</w:t>
+      </w:r>
+      <w:r>
+        <w:t xml:space="preserve"> </w:t>
+      </w:r>
+      <w:r>
+        <w:t xml:space="preserve">and after</w:t>
+      </w:r>
+      <w:r>
+        <w:t xml:space="preserve"> </w:t>
+      </w:r>
+      <w:r>
+        <w:rPr>
+          <w:rStyle w:val="VerbatimChar"/>
+        </w:rPr>
+        <w:t xml:space="preserve">Export-Csv</w:t>
+      </w:r>
+      <w:r>
+        <w:t xml:space="preserve">. It is also</w:t>
+      </w:r>
+      <w:r>
+        <w:t xml:space="preserve"> </w:t>
+      </w:r>
+      <w:r>
+        <w:rPr>
+          <w:rStyle w:val="VerbatimChar"/>
+        </w:rPr>
+        <w:t xml:space="preserve">SamAccountName</w:t>
+      </w:r>
+      <w:r>
+        <w:t xml:space="preserve"> </w:t>
+      </w:r>
+      <w:r>
+        <w:t xml:space="preserve">— one</w:t>
+      </w:r>
+      <w:r>
+        <w:t xml:space="preserve"> </w:t>
+      </w:r>
+      <w:r>
+        <w:rPr>
+          <w:rStyle w:val="VerbatimChar"/>
+        </w:rPr>
+        <w:t xml:space="preserve">m</w:t>
+      </w:r>
+      <w:r>
+        <w:t xml:space="preserve">,</w:t>
+      </w:r>
+      <w:r>
+        <w:t xml:space="preserve"> </w:t>
+      </w:r>
+      <w:r>
+        <w:t xml:space="preserve">no</w:t>
+      </w:r>
+      <w:r>
+        <w:t xml:space="preserve"> </w:t>
+      </w:r>
+      <w:r>
+        <w:rPr>
+          <w:rStyle w:val="VerbatimChar"/>
+        </w:rPr>
+        <w:t xml:space="preserve">e</w:t>
+      </w:r>
+      <w:r>
+        <w:t xml:space="preserve"> </w:t>
+      </w:r>
+      <w:r>
+        <w:t xml:space="preserve">in the middle. If the line keeps failing, run it in three short steps</w:t>
+      </w:r>
+      <w:r>
+        <w:t xml:space="preserve"> </w:t>
+      </w:r>
+      <w:r>
+        <w:t xml:space="preserve">instead, which is much harder to mistype:</w:t>
+      </w:r>
+    </w:p>
+    <w:p>
+      <w:pPr>
+        <w:numPr>
+          <w:ilvl w:val="0"/>
+          <w:numId w:val="1000"/>
+        </w:numPr>
+        <w:pStyle w:val="SourceCode"/>
+      </w:pPr>
+      <w:r>
+        <w:rPr>
+          <w:rStyle w:val="VariableTok"/>
+        </w:rPr>
+        <w:t xml:space="preserve">$ou</w:t>
+      </w:r>
+      <w:r>
+        <w:rPr>
+          <w:rStyle w:val="NormalTok"/>
+        </w:rPr>
+        <w:t xml:space="preserve"> = </w:t>
+      </w:r>
+      <w:r>
+        <w:rPr>
+          <w:rStyle w:val="StringTok"/>
+        </w:rPr>
+        <w:t xml:space="preserve">"OU=Pod03,OU=Students,DC=acs-p01,DC=local"</w:t>
+      </w:r>
+      <w:r>
+        <w:br/>
+      </w:r>
+      <w:r>
+        <w:rPr>
+          <w:rStyle w:val="VariableTok"/>
+        </w:rPr>
+        <w:t xml:space="preserve">$users</w:t>
+      </w:r>
+      <w:r>
+        <w:rPr>
+          <w:rStyle w:val="NormalTok"/>
+        </w:rPr>
+        <w:t xml:space="preserve"> = </w:t>
+      </w:r>
+      <w:r>
+        <w:rPr>
+          <w:rStyle w:val="FunctionTok"/>
+        </w:rPr>
+        <w:t xml:space="preserve">Get-ADUser</w:t>
+      </w:r>
+      <w:r>
+        <w:rPr>
+          <w:rStyle w:val="NormalTok"/>
+        </w:rPr>
+        <w:t xml:space="preserve"> -Filter {Enabled -eq </w:t>
+      </w:r>
+      <w:r>
+        <w:rPr>
+          <w:rStyle w:val="VariableTok"/>
+        </w:rPr>
+        <w:t xml:space="preserve">$true</w:t>
+      </w:r>
+      <w:r>
+        <w:rPr>
+          <w:rStyle w:val="NormalTok"/>
+        </w:rPr>
+        <w:t xml:space="preserve">} -SearchBase </w:t>
+      </w:r>
+      <w:r>
+        <w:rPr>
+          <w:rStyle w:val="VariableTok"/>
+        </w:rPr>
+        <w:t xml:space="preserve">$ou</w:t>
+      </w:r>
+      <w:r>
+        <w:br/>
+      </w:r>
+      <w:r>
+        <w:rPr>
+          <w:rStyle w:val="VariableTok"/>
+        </w:rPr>
+        <w:t xml:space="preserve">$users</w:t>
+      </w:r>
+      <w:r>
+        <w:rPr>
+          <w:rStyle w:val="NormalTok"/>
+        </w:rPr>
+        <w:t xml:space="preserve"> | </w:t>
       </w:r>
       <w:r>
         <w:rPr>
@@ -8623,6 +8935,72 @@
       </w:r>
       <w:r>
         <w:t xml:space="preserve">with your actual pod number</w:t>
+      </w:r>
+    </w:p>
+    <w:p>
+      <w:pPr>
+        <w:numPr>
+          <w:ilvl w:val="0"/>
+          <w:numId w:val="1037"/>
+        </w:numPr>
+        <w:pStyle w:val="Compact"/>
+      </w:pPr>
+      <w:r>
+        <w:t xml:space="preserve">If PowerShell says a term</w:t>
+      </w:r>
+      <w:r>
+        <w:t xml:space="preserve"> </w:t>
+      </w:r>
+      <w:r>
+        <w:rPr>
+          <w:b/>
+        </w:rPr>
+        <w:t xml:space="preserve">"is not recognized as the name of a cmdlet"</w:t>
+      </w:r>
+      <w:r>
+        <w:t xml:space="preserve"> </w:t>
+      </w:r>
+      <w:r>
+        <w:t xml:space="preserve">and the</w:t>
+      </w:r>
+      <w:r>
+        <w:t xml:space="preserve"> </w:t>
+      </w:r>
+      <w:r>
+        <w:t xml:space="preserve">name in the message looks joined together (for example</w:t>
+      </w:r>
+      <w:r>
+        <w:t xml:space="preserve"> </w:t>
+      </w:r>
+      <w:r>
+        <w:rPr>
+          <w:rStyle w:val="VerbatimChar"/>
+        </w:rPr>
+        <w:t xml:space="preserve">Get-ADUser-Filter</w:t>
+      </w:r>
+      <w:r>
+        <w:t xml:space="preserve">), the</w:t>
+      </w:r>
+      <w:r>
+        <w:t xml:space="preserve"> </w:t>
+      </w:r>
+      <w:r>
+        <w:t xml:space="preserve">spaces were lost when you pasted — retype the line with a space before every</w:t>
+      </w:r>
+      <w:r>
+        <w:t xml:space="preserve"> </w:t>
+      </w:r>
+      <w:r>
+        <w:rPr>
+          <w:rStyle w:val="VerbatimChar"/>
+        </w:rPr>
+        <w:t xml:space="preserve">-</w:t>
+      </w:r>
+      <w:r>
+        <w:t xml:space="preserve"> </w:t>
+      </w:r>
+      <w:r>
+        <w:t xml:space="preserve">option, or type it in the shorter multi-line form shown in that lab</w:t>
       </w:r>
     </w:p>
     <w:p>

</xml_diff>